<commit_message>
commit update: subida de la actividad 1 tarea
</commit_message>
<xml_diff>
--- a/caso de estudio- sistema de gestion de incidentes.docx
+++ b/caso de estudio- sistema de gestion de incidentes.docx
@@ -858,6 +858,7 @@
       <w:r>
         <w:rPr>
           <w:b/>
+          <w:lang w:val="es-EC"/>
         </w:rPr>
         <w:lastRenderedPageBreak/>
         <w:t>I</w:t>
@@ -987,8 +988,6 @@
         </w:rPr>
         <w:t>.</w:t>
       </w:r>
-      <w:bookmarkStart w:id="0" w:name="_GoBack"/>
-      <w:bookmarkEnd w:id="0"/>
     </w:p>
     <w:p>
       <w:pPr>
@@ -2661,12 +2660,31 @@
         </w:rPr>
         <w:t xml:space="preserve">Aplicación en el sistema </w:t>
       </w:r>
+      <w:proofErr w:type="spellStart"/>
       <w:r>
         <w:rPr>
           <w:b/>
-        </w:rPr>
-        <w:t>Help Desk</w:t>
-      </w:r>
+          <w:lang w:val="es-EC"/>
+        </w:rPr>
+        <w:t>Help</w:t>
+      </w:r>
+      <w:proofErr w:type="spellEnd"/>
+      <w:r>
+        <w:rPr>
+          <w:b/>
+          <w:lang w:val="es-EC"/>
+        </w:rPr>
+        <w:t xml:space="preserve"> </w:t>
+      </w:r>
+      <w:proofErr w:type="spellStart"/>
+      <w:r>
+        <w:rPr>
+          <w:b/>
+          <w:lang w:val="es-EC"/>
+        </w:rPr>
+        <w:t>Desk</w:t>
+      </w:r>
+      <w:proofErr w:type="spellEnd"/>
     </w:p>
     <w:p>
       <w:pPr>
@@ -2682,22 +2700,23 @@
         <w:t xml:space="preserve">Se implementa </w:t>
       </w:r>
       <w:r>
-        <w:t xml:space="preserve">en la </w:t>
-      </w:r>
-      <w:proofErr w:type="spellStart"/>
-      <w:r>
-        <w:t>clase</w:t>
-      </w:r>
-      <w:proofErr w:type="spellEnd"/>
-      <w:r>
-        <w:t xml:space="preserve"> </w:t>
-      </w:r>
-      <w:proofErr w:type="spellStart"/>
-      <w:r>
+        <w:rPr>
+          <w:lang w:val="es-EC"/>
+        </w:rPr>
+        <w:t xml:space="preserve">en la clase </w:t>
+      </w:r>
+      <w:proofErr w:type="spellStart"/>
+      <w:r>
+        <w:rPr>
+          <w:lang w:val="es-EC"/>
+        </w:rPr>
         <w:t>TicketManager</w:t>
       </w:r>
       <w:proofErr w:type="spellEnd"/>
       <w:r>
+        <w:rPr>
+          <w:lang w:val="es-EC"/>
+        </w:rPr>
         <w:t>,</w:t>
       </w:r>
       <w:r>
@@ -2712,21 +2731,15 @@
         <w:ind w:left="709"/>
         <w:rPr>
           <w:b/>
-        </w:rPr>
-      </w:pPr>
-      <w:proofErr w:type="spellStart"/>
+          <w:lang w:val="es-EC"/>
+        </w:rPr>
+      </w:pPr>
       <w:r>
         <w:rPr>
           <w:b/>
-        </w:rPr>
-        <w:t>Problema</w:t>
-      </w:r>
-      <w:proofErr w:type="spellEnd"/>
-      <w:r>
-        <w:rPr>
-          <w:b/>
-        </w:rPr>
-        <w:t xml:space="preserve"> que resuelve</w:t>
+          <w:lang w:val="es-EC"/>
+        </w:rPr>
+        <w:t>Problema que resuelve</w:t>
       </w:r>
     </w:p>
     <w:p>
@@ -3607,8 +3620,16 @@
         <w:rPr>
           <w:b/>
         </w:rPr>
-        <w:t xml:space="preserve"> que resuelve</w:t>
-      </w:r>
+        <w:t xml:space="preserve"> que </w:t>
+      </w:r>
+      <w:proofErr w:type="spellStart"/>
+      <w:r>
+        <w:rPr>
+          <w:b/>
+        </w:rPr>
+        <w:t>resuelve</w:t>
+      </w:r>
+      <w:proofErr w:type="spellEnd"/>
     </w:p>
     <w:p>
       <w:pPr>
@@ -4476,163 +4497,568 @@
     <w:p>
       <w:pPr>
         <w:rPr>
-          <w:lang w:val="es-EC"/>
-        </w:rPr>
-      </w:pPr>
-    </w:p>
-    <w:p>
-      <w:pPr>
-        <w:rPr>
-          <w:lang w:val="es-EC"/>
-        </w:rPr>
-      </w:pPr>
-    </w:p>
-    <w:p>
-      <w:pPr>
-        <w:rPr>
-          <w:lang w:val="es-EC"/>
-        </w:rPr>
-      </w:pPr>
-    </w:p>
-    <w:p>
-      <w:pPr>
-        <w:rPr>
-          <w:lang w:val="es-EC"/>
-        </w:rPr>
-      </w:pPr>
-    </w:p>
-    <w:p>
-      <w:pPr>
-        <w:rPr>
-          <w:lang w:val="es-EC"/>
-        </w:rPr>
-      </w:pPr>
-    </w:p>
-    <w:p>
-      <w:pPr>
-        <w:rPr>
-          <w:lang w:val="es-EC"/>
-        </w:rPr>
-      </w:pPr>
-    </w:p>
-    <w:p>
-      <w:pPr>
-        <w:rPr>
-          <w:lang w:val="es-EC"/>
-        </w:rPr>
-      </w:pPr>
-    </w:p>
-    <w:p>
-      <w:pPr>
-        <w:rPr>
-          <w:lang w:val="es-EC"/>
-        </w:rPr>
-      </w:pPr>
-    </w:p>
-    <w:p>
-      <w:pPr>
-        <w:rPr>
-          <w:lang w:val="es-EC"/>
-        </w:rPr>
-      </w:pPr>
-    </w:p>
-    <w:p>
-      <w:pPr>
-        <w:rPr>
-          <w:lang w:val="es-EC"/>
-        </w:rPr>
-      </w:pPr>
-    </w:p>
-    <w:p>
-      <w:pPr>
-        <w:rPr>
-          <w:lang w:val="es-EC"/>
-        </w:rPr>
-      </w:pPr>
-    </w:p>
-    <w:p>
-      <w:pPr>
-        <w:rPr>
-          <w:lang w:val="es-EC"/>
-        </w:rPr>
-      </w:pPr>
-    </w:p>
-    <w:p>
-      <w:pPr>
-        <w:rPr>
-          <w:lang w:val="es-EC"/>
-        </w:rPr>
-      </w:pPr>
-    </w:p>
-    <w:p>
-      <w:pPr>
-        <w:rPr>
-          <w:lang w:val="es-EC"/>
-        </w:rPr>
-      </w:pPr>
-    </w:p>
-    <w:p>
-      <w:pPr>
-        <w:rPr>
-          <w:lang w:val="es-EC"/>
-        </w:rPr>
-      </w:pPr>
-    </w:p>
-    <w:p>
-      <w:pPr>
-        <w:rPr>
-          <w:lang w:val="es-EC"/>
-        </w:rPr>
-      </w:pPr>
-    </w:p>
-    <w:p>
-      <w:pPr>
-        <w:rPr>
-          <w:lang w:val="es-EC"/>
-        </w:rPr>
-      </w:pPr>
-    </w:p>
-    <w:p>
-      <w:pPr>
-        <w:rPr>
-          <w:lang w:val="es-EC"/>
-        </w:rPr>
-      </w:pPr>
-    </w:p>
-    <w:p>
-      <w:pPr>
-        <w:rPr>
-          <w:lang w:val="es-EC"/>
-        </w:rPr>
-      </w:pPr>
-    </w:p>
-    <w:p>
-      <w:pPr>
-        <w:rPr>
-          <w:lang w:val="es-EC"/>
-        </w:rPr>
-      </w:pPr>
-    </w:p>
-    <w:p>
-      <w:pPr>
-        <w:rPr>
-          <w:lang w:val="es-EC"/>
-        </w:rPr>
-      </w:pPr>
-    </w:p>
-    <w:p>
-      <w:pPr>
-        <w:rPr>
-          <w:lang w:val="es-EC"/>
-        </w:rPr>
-      </w:pPr>
-    </w:p>
-    <w:p>
-      <w:pPr>
-        <w:rPr>
-          <w:lang w:val="es-EC"/>
-        </w:rPr>
-      </w:pPr>
+          <w:b/>
+          <w:lang w:val="es-EC"/>
+        </w:rPr>
+      </w:pPr>
+      <w:r>
+        <w:rPr>
+          <w:b/>
+          <w:lang w:val="es-EC"/>
+        </w:rPr>
+        <w:lastRenderedPageBreak/>
+        <w:t>CAPTURAS DE PANTALLA</w:t>
+      </w:r>
+    </w:p>
+    <w:p>
+      <w:pPr>
+        <w:rPr>
+          <w:lang w:val="es-EC"/>
+        </w:rPr>
+      </w:pPr>
+      <w:r>
+        <w:rPr>
+          <w:lang w:val="es-EC"/>
+        </w:rPr>
+        <w:t>Capturas de pantalla del archivo subido a la nube por medio de comando</w:t>
+      </w:r>
+    </w:p>
+    <w:p>
+      <w:pPr>
+        <w:rPr>
+          <w:b/>
+          <w:lang w:val="es-EC"/>
+        </w:rPr>
+      </w:pPr>
+    </w:p>
+    <w:p>
+      <w:pPr>
+        <w:rPr>
+          <w:lang w:val="es-EC"/>
+        </w:rPr>
+      </w:pPr>
+      <w:r>
+        <w:rPr>
+          <w:noProof/>
+        </w:rPr>
+        <w:drawing>
+          <wp:inline distT="0" distB="0" distL="0" distR="0">
+            <wp:extent cx="5612130" cy="3073720"/>
+            <wp:effectExtent l="0" t="0" r="7620" b="0"/>
+            <wp:docPr id="5" name="Imagen 5" descr="C:\Users\Personal\Pictures\Screenshots\Captura de pantalla 2026-05-16 032904.png"/>
+            <wp:cNvGraphicFramePr>
+              <a:graphicFrameLocks xmlns:a="http://schemas.openxmlformats.org/drawingml/2006/main" noChangeAspect="1"/>
+            </wp:cNvGraphicFramePr>
+            <a:graphic xmlns:a="http://schemas.openxmlformats.org/drawingml/2006/main">
+              <a:graphicData uri="http://schemas.openxmlformats.org/drawingml/2006/picture">
+                <pic:pic xmlns:pic="http://schemas.openxmlformats.org/drawingml/2006/picture">
+                  <pic:nvPicPr>
+                    <pic:cNvPr id="0" name="Picture 1" descr="C:\Users\Personal\Pictures\Screenshots\Captura de pantalla 2026-05-16 032904.png"/>
+                    <pic:cNvPicPr>
+                      <a:picLocks noChangeAspect="1" noChangeArrowheads="1"/>
+                    </pic:cNvPicPr>
+                  </pic:nvPicPr>
+                  <pic:blipFill>
+                    <a:blip r:embed="rId9">
+                      <a:extLst>
+                        <a:ext uri="{28A0092B-C50C-407E-A947-70E740481C1C}">
+                          <a14:useLocalDpi xmlns:a14="http://schemas.microsoft.com/office/drawing/2010/main" val="0"/>
+                        </a:ext>
+                      </a:extLst>
+                    </a:blip>
+                    <a:srcRect/>
+                    <a:stretch>
+                      <a:fillRect/>
+                    </a:stretch>
+                  </pic:blipFill>
+                  <pic:spPr bwMode="auto">
+                    <a:xfrm>
+                      <a:off x="0" y="0"/>
+                      <a:ext cx="5612130" cy="3073720"/>
+                    </a:xfrm>
+                    <a:prstGeom prst="rect">
+                      <a:avLst/>
+                    </a:prstGeom>
+                    <a:noFill/>
+                    <a:ln>
+                      <a:noFill/>
+                    </a:ln>
+                  </pic:spPr>
+                </pic:pic>
+              </a:graphicData>
+            </a:graphic>
+          </wp:inline>
+        </w:drawing>
+      </w:r>
+    </w:p>
+    <w:p>
+      <w:pPr>
+        <w:pBdr>
+          <w:top w:val="none" w:sz="4" w:space="0" w:color="000000"/>
+          <w:left w:val="none" w:sz="4" w:space="1" w:color="000000"/>
+          <w:bottom w:val="none" w:sz="4" w:space="0" w:color="000000"/>
+          <w:right w:val="none" w:sz="4" w:space="0" w:color="000000"/>
+        </w:pBdr>
+        <w:rPr>
+          <w:rFonts w:ascii="Courier New" w:eastAsia="Courier New" w:hAnsi="Courier New" w:cs="Courier New"/>
+          <w:color w:val="000000"/>
+          <w:sz w:val="20"/>
+        </w:rPr>
+      </w:pPr>
+      <w:proofErr w:type="spellStart"/>
+      <w:r>
+        <w:rPr>
+          <w:rFonts w:ascii="Courier New" w:eastAsia="Courier New" w:hAnsi="Courier New" w:cs="Courier New"/>
+          <w:color w:val="000000"/>
+          <w:sz w:val="20"/>
+        </w:rPr>
+        <w:t>git</w:t>
+      </w:r>
+      <w:proofErr w:type="spellEnd"/>
+      <w:r>
+        <w:rPr>
+          <w:rFonts w:ascii="Courier New" w:eastAsia="Courier New" w:hAnsi="Courier New" w:cs="Courier New"/>
+          <w:color w:val="000000"/>
+          <w:sz w:val="20"/>
+        </w:rPr>
+        <w:t xml:space="preserve"> </w:t>
+      </w:r>
+      <w:proofErr w:type="gramStart"/>
+      <w:r>
+        <w:rPr>
+          <w:rFonts w:ascii="Courier New" w:eastAsia="Courier New" w:hAnsi="Courier New" w:cs="Courier New"/>
+          <w:color w:val="000000"/>
+          <w:sz w:val="20"/>
+        </w:rPr>
+        <w:t>add .</w:t>
+      </w:r>
+      <w:proofErr w:type="gramEnd"/>
+      <w:r>
+        <w:rPr>
+          <w:rFonts w:ascii="Courier New" w:eastAsia="Courier New" w:hAnsi="Courier New" w:cs="Courier New"/>
+          <w:color w:val="000000"/>
+          <w:sz w:val="20"/>
+        </w:rPr>
+        <w:t xml:space="preserve"> </w:t>
+      </w:r>
+    </w:p>
+    <w:p>
+      <w:pPr>
+        <w:pBdr>
+          <w:top w:val="none" w:sz="4" w:space="0" w:color="000000"/>
+          <w:left w:val="none" w:sz="4" w:space="1" w:color="000000"/>
+          <w:bottom w:val="none" w:sz="4" w:space="0" w:color="000000"/>
+          <w:right w:val="none" w:sz="4" w:space="0" w:color="000000"/>
+        </w:pBdr>
+        <w:rPr>
+          <w:rFonts w:ascii="Courier New" w:eastAsia="Courier New" w:hAnsi="Courier New" w:cs="Courier New"/>
+          <w:color w:val="000000"/>
+          <w:sz w:val="20"/>
+        </w:rPr>
+      </w:pPr>
+      <w:r>
+        <w:rPr>
+          <w:rFonts w:ascii="Courier New" w:eastAsia="Courier New" w:hAnsi="Courier New" w:cs="Courier New"/>
+          <w:noProof/>
+          <w:color w:val="000000"/>
+          <w:sz w:val="20"/>
+        </w:rPr>
+        <w:drawing>
+          <wp:inline distT="0" distB="0" distL="0" distR="0">
+            <wp:extent cx="5612130" cy="3502935"/>
+            <wp:effectExtent l="0" t="0" r="7620" b="2540"/>
+            <wp:docPr id="8" name="Imagen 8" descr="C:\Users\Personal\Pictures\Screenshots\Captura de pantalla 2026-05-16 032730.png"/>
+            <wp:cNvGraphicFramePr>
+              <a:graphicFrameLocks xmlns:a="http://schemas.openxmlformats.org/drawingml/2006/main" noChangeAspect="1"/>
+            </wp:cNvGraphicFramePr>
+            <a:graphic xmlns:a="http://schemas.openxmlformats.org/drawingml/2006/main">
+              <a:graphicData uri="http://schemas.openxmlformats.org/drawingml/2006/picture">
+                <pic:pic xmlns:pic="http://schemas.openxmlformats.org/drawingml/2006/picture">
+                  <pic:nvPicPr>
+                    <pic:cNvPr id="0" name="Picture 2" descr="C:\Users\Personal\Pictures\Screenshots\Captura de pantalla 2026-05-16 032730.png"/>
+                    <pic:cNvPicPr>
+                      <a:picLocks noChangeAspect="1" noChangeArrowheads="1"/>
+                    </pic:cNvPicPr>
+                  </pic:nvPicPr>
+                  <pic:blipFill>
+                    <a:blip r:embed="rId10">
+                      <a:extLst>
+                        <a:ext uri="{28A0092B-C50C-407E-A947-70E740481C1C}">
+                          <a14:useLocalDpi xmlns:a14="http://schemas.microsoft.com/office/drawing/2010/main" val="0"/>
+                        </a:ext>
+                      </a:extLst>
+                    </a:blip>
+                    <a:srcRect/>
+                    <a:stretch>
+                      <a:fillRect/>
+                    </a:stretch>
+                  </pic:blipFill>
+                  <pic:spPr bwMode="auto">
+                    <a:xfrm>
+                      <a:off x="0" y="0"/>
+                      <a:ext cx="5612130" cy="3502935"/>
+                    </a:xfrm>
+                    <a:prstGeom prst="rect">
+                      <a:avLst/>
+                    </a:prstGeom>
+                    <a:noFill/>
+                    <a:ln>
+                      <a:noFill/>
+                    </a:ln>
+                  </pic:spPr>
+                </pic:pic>
+              </a:graphicData>
+            </a:graphic>
+          </wp:inline>
+        </w:drawing>
+      </w:r>
+    </w:p>
+    <w:p>
+      <w:pPr>
+        <w:pBdr>
+          <w:top w:val="none" w:sz="4" w:space="0" w:color="000000"/>
+          <w:left w:val="none" w:sz="4" w:space="1" w:color="000000"/>
+          <w:bottom w:val="none" w:sz="4" w:space="0" w:color="000000"/>
+          <w:right w:val="none" w:sz="4" w:space="0" w:color="000000"/>
+        </w:pBdr>
+        <w:rPr>
+          <w:rFonts w:ascii="Courier New" w:eastAsia="Courier New" w:hAnsi="Courier New" w:cs="Courier New"/>
+          <w:color w:val="000000"/>
+          <w:sz w:val="20"/>
+        </w:rPr>
+      </w:pPr>
+    </w:p>
+    <w:p>
+      <w:pPr>
+        <w:pBdr>
+          <w:top w:val="none" w:sz="4" w:space="0" w:color="000000"/>
+          <w:left w:val="none" w:sz="4" w:space="1" w:color="000000"/>
+          <w:bottom w:val="none" w:sz="4" w:space="0" w:color="000000"/>
+          <w:right w:val="none" w:sz="4" w:space="0" w:color="000000"/>
+        </w:pBdr>
+      </w:pPr>
+      <w:proofErr w:type="spellStart"/>
+      <w:r>
+        <w:rPr>
+          <w:rFonts w:ascii="Courier New" w:eastAsia="Courier New" w:hAnsi="Courier New" w:cs="Courier New"/>
+          <w:color w:val="000000"/>
+          <w:sz w:val="20"/>
+        </w:rPr>
+        <w:lastRenderedPageBreak/>
+        <w:t>git</w:t>
+      </w:r>
+      <w:proofErr w:type="spellEnd"/>
+      <w:r>
+        <w:rPr>
+          <w:rFonts w:ascii="Courier New" w:eastAsia="Courier New" w:hAnsi="Courier New" w:cs="Courier New"/>
+          <w:color w:val="000000"/>
+          <w:sz w:val="20"/>
+        </w:rPr>
+        <w:t xml:space="preserve"> commit -m "commit update: </w:t>
+      </w:r>
+      <w:proofErr w:type="spellStart"/>
+      <w:r>
+        <w:rPr>
+          <w:rFonts w:ascii="Courier New" w:eastAsia="Courier New" w:hAnsi="Courier New" w:cs="Courier New"/>
+          <w:color w:val="000000"/>
+          <w:sz w:val="20"/>
+        </w:rPr>
+        <w:t>subida</w:t>
+      </w:r>
+      <w:proofErr w:type="spellEnd"/>
+      <w:r>
+        <w:rPr>
+          <w:rFonts w:ascii="Courier New" w:eastAsia="Courier New" w:hAnsi="Courier New" w:cs="Courier New"/>
+          <w:color w:val="000000"/>
+          <w:sz w:val="20"/>
+        </w:rPr>
+        <w:t xml:space="preserve"> de la </w:t>
+      </w:r>
+      <w:proofErr w:type="spellStart"/>
+      <w:r>
+        <w:rPr>
+          <w:rFonts w:ascii="Courier New" w:eastAsia="Courier New" w:hAnsi="Courier New" w:cs="Courier New"/>
+          <w:color w:val="000000"/>
+          <w:sz w:val="20"/>
+        </w:rPr>
+        <w:t>actividad</w:t>
+      </w:r>
+      <w:proofErr w:type="spellEnd"/>
+      <w:r>
+        <w:rPr>
+          <w:rFonts w:ascii="Courier New" w:eastAsia="Courier New" w:hAnsi="Courier New" w:cs="Courier New"/>
+          <w:color w:val="000000"/>
+          <w:sz w:val="20"/>
+        </w:rPr>
+        <w:t xml:space="preserve"> 1 </w:t>
+      </w:r>
+      <w:proofErr w:type="spellStart"/>
+      <w:r>
+        <w:rPr>
+          <w:rFonts w:ascii="Courier New" w:eastAsia="Courier New" w:hAnsi="Courier New" w:cs="Courier New"/>
+          <w:color w:val="000000"/>
+          <w:sz w:val="20"/>
+        </w:rPr>
+        <w:t>tarea</w:t>
+      </w:r>
+      <w:proofErr w:type="spellEnd"/>
+      <w:r>
+        <w:rPr>
+          <w:rFonts w:ascii="Courier New" w:eastAsia="Courier New" w:hAnsi="Courier New" w:cs="Courier New"/>
+          <w:color w:val="000000"/>
+          <w:sz w:val="20"/>
+        </w:rPr>
+        <w:t>"</w:t>
+      </w:r>
+    </w:p>
+    <w:p>
+      <w:r>
+        <w:rPr>
+          <w:noProof/>
+        </w:rPr>
+        <w:drawing>
+          <wp:inline distT="0" distB="0" distL="0" distR="0">
+            <wp:extent cx="5612130" cy="3599700"/>
+            <wp:effectExtent l="0" t="0" r="7620" b="1270"/>
+            <wp:docPr id="9" name="Imagen 9" descr="C:\Users\Personal\Pictures\Screenshots\Captura de pantalla 2026-05-16 032806.png"/>
+            <wp:cNvGraphicFramePr>
+              <a:graphicFrameLocks xmlns:a="http://schemas.openxmlformats.org/drawingml/2006/main" noChangeAspect="1"/>
+            </wp:cNvGraphicFramePr>
+            <a:graphic xmlns:a="http://schemas.openxmlformats.org/drawingml/2006/main">
+              <a:graphicData uri="http://schemas.openxmlformats.org/drawingml/2006/picture">
+                <pic:pic xmlns:pic="http://schemas.openxmlformats.org/drawingml/2006/picture">
+                  <pic:nvPicPr>
+                    <pic:cNvPr id="0" name="Picture 3" descr="C:\Users\Personal\Pictures\Screenshots\Captura de pantalla 2026-05-16 032806.png"/>
+                    <pic:cNvPicPr>
+                      <a:picLocks noChangeAspect="1" noChangeArrowheads="1"/>
+                    </pic:cNvPicPr>
+                  </pic:nvPicPr>
+                  <pic:blipFill>
+                    <a:blip r:embed="rId11">
+                      <a:extLst>
+                        <a:ext uri="{28A0092B-C50C-407E-A947-70E740481C1C}">
+                          <a14:useLocalDpi xmlns:a14="http://schemas.microsoft.com/office/drawing/2010/main" val="0"/>
+                        </a:ext>
+                      </a:extLst>
+                    </a:blip>
+                    <a:srcRect/>
+                    <a:stretch>
+                      <a:fillRect/>
+                    </a:stretch>
+                  </pic:blipFill>
+                  <pic:spPr bwMode="auto">
+                    <a:xfrm>
+                      <a:off x="0" y="0"/>
+                      <a:ext cx="5612130" cy="3599700"/>
+                    </a:xfrm>
+                    <a:prstGeom prst="rect">
+                      <a:avLst/>
+                    </a:prstGeom>
+                    <a:noFill/>
+                    <a:ln>
+                      <a:noFill/>
+                    </a:ln>
+                  </pic:spPr>
+                </pic:pic>
+              </a:graphicData>
+            </a:graphic>
+          </wp:inline>
+        </w:drawing>
+      </w:r>
+    </w:p>
+    <w:p/>
+    <w:p>
+      <w:pPr>
+        <w:pBdr>
+          <w:top w:val="none" w:sz="4" w:space="0" w:color="000000"/>
+          <w:left w:val="none" w:sz="4" w:space="1" w:color="000000"/>
+          <w:bottom w:val="none" w:sz="4" w:space="0" w:color="000000"/>
+          <w:right w:val="none" w:sz="4" w:space="0" w:color="000000"/>
+        </w:pBdr>
+        <w:rPr>
+          <w:rFonts w:ascii="Courier New" w:eastAsia="Courier New" w:hAnsi="Courier New" w:cs="Courier New"/>
+          <w:color w:val="000000"/>
+          <w:sz w:val="20"/>
+        </w:rPr>
+      </w:pPr>
+      <w:proofErr w:type="spellStart"/>
+      <w:r>
+        <w:rPr>
+          <w:rFonts w:ascii="Courier New" w:eastAsia="Courier New" w:hAnsi="Courier New" w:cs="Courier New"/>
+          <w:color w:val="000000"/>
+          <w:sz w:val="20"/>
+        </w:rPr>
+        <w:t>git</w:t>
+      </w:r>
+      <w:proofErr w:type="spellEnd"/>
+      <w:r>
+        <w:rPr>
+          <w:rFonts w:ascii="Courier New" w:eastAsia="Courier New" w:hAnsi="Courier New" w:cs="Courier New"/>
+          <w:color w:val="000000"/>
+          <w:sz w:val="20"/>
+        </w:rPr>
+        <w:t xml:space="preserve"> push -u origin main</w:t>
+      </w:r>
+    </w:p>
+    <w:p>
+      <w:pPr>
+        <w:rPr>
+          <w:lang w:val="es-EC"/>
+        </w:rPr>
+      </w:pPr>
+      <w:r>
+        <w:rPr>
+          <w:noProof/>
+        </w:rPr>
+        <w:drawing>
+          <wp:inline distT="0" distB="0" distL="0" distR="0" wp14:anchorId="4A7943ED" wp14:editId="292FC2E0">
+            <wp:extent cx="5612130" cy="3579495"/>
+            <wp:effectExtent l="0" t="0" r="7620" b="1905"/>
+            <wp:docPr id="10" name="Imagen 10" descr="C:\Users\Personal\Pictures\Screenshots\Captura de pantalla 2026-05-16 032841.png"/>
+            <wp:cNvGraphicFramePr>
+              <a:graphicFrameLocks xmlns:a="http://schemas.openxmlformats.org/drawingml/2006/main" noChangeAspect="1"/>
+            </wp:cNvGraphicFramePr>
+            <a:graphic xmlns:a="http://schemas.openxmlformats.org/drawingml/2006/main">
+              <a:graphicData uri="http://schemas.openxmlformats.org/drawingml/2006/picture">
+                <pic:pic xmlns:pic="http://schemas.openxmlformats.org/drawingml/2006/picture">
+                  <pic:nvPicPr>
+                    <pic:cNvPr id="0" name="Picture 4" descr="C:\Users\Personal\Pictures\Screenshots\Captura de pantalla 2026-05-16 032841.png"/>
+                    <pic:cNvPicPr>
+                      <a:picLocks noChangeAspect="1" noChangeArrowheads="1"/>
+                    </pic:cNvPicPr>
+                  </pic:nvPicPr>
+                  <pic:blipFill>
+                    <a:blip r:embed="rId12">
+                      <a:extLst>
+                        <a:ext uri="{28A0092B-C50C-407E-A947-70E740481C1C}">
+                          <a14:useLocalDpi xmlns:a14="http://schemas.microsoft.com/office/drawing/2010/main" val="0"/>
+                        </a:ext>
+                      </a:extLst>
+                    </a:blip>
+                    <a:srcRect/>
+                    <a:stretch>
+                      <a:fillRect/>
+                    </a:stretch>
+                  </pic:blipFill>
+                  <pic:spPr bwMode="auto">
+                    <a:xfrm>
+                      <a:off x="0" y="0"/>
+                      <a:ext cx="5612130" cy="3579495"/>
+                    </a:xfrm>
+                    <a:prstGeom prst="rect">
+                      <a:avLst/>
+                    </a:prstGeom>
+                    <a:noFill/>
+                    <a:ln>
+                      <a:noFill/>
+                    </a:ln>
+                  </pic:spPr>
+                </pic:pic>
+              </a:graphicData>
+            </a:graphic>
+          </wp:inline>
+        </w:drawing>
+      </w:r>
+    </w:p>
+    <w:p>
+      <w:pPr>
+        <w:rPr>
+          <w:lang w:val="es-EC"/>
+        </w:rPr>
+      </w:pPr>
+      <w:r>
+        <w:rPr>
+          <w:lang w:val="es-EC"/>
+        </w:rPr>
+        <w:lastRenderedPageBreak/>
+        <w:t>Link</w:t>
+      </w:r>
+    </w:p>
+    <w:p>
+      <w:hyperlink r:id="rId13" w:history="1">
+        <w:proofErr w:type="spellStart"/>
+        <w:r>
+          <w:rPr>
+            <w:rStyle w:val="Hipervnculo"/>
+            <w:lang w:val="es-EC"/>
+          </w:rPr>
+          <w:t>DesarrolloSoftwareUTMChG</w:t>
+        </w:r>
+        <w:proofErr w:type="spellEnd"/>
+        <w:r>
+          <w:rPr>
+            <w:rStyle w:val="Hipervnculo"/>
+            <w:lang w:val="es-EC"/>
+          </w:rPr>
+          <w:t xml:space="preserve">/caso de estudio- sistema de </w:t>
+        </w:r>
+        <w:proofErr w:type="spellStart"/>
+        <w:r>
+          <w:rPr>
+            <w:rStyle w:val="Hipervnculo"/>
+            <w:lang w:val="es-EC"/>
+          </w:rPr>
+          <w:t>gestion</w:t>
+        </w:r>
+        <w:proofErr w:type="spellEnd"/>
+        <w:r>
+          <w:rPr>
+            <w:rStyle w:val="Hipervnculo"/>
+            <w:lang w:val="es-EC"/>
+          </w:rPr>
+          <w:t xml:space="preserve"> de incidentes.docx at </w:t>
+        </w:r>
+        <w:proofErr w:type="spellStart"/>
+        <w:r>
+          <w:rPr>
+            <w:rStyle w:val="Hipervnculo"/>
+            <w:lang w:val="es-EC"/>
+          </w:rPr>
+          <w:t>main</w:t>
+        </w:r>
+        <w:proofErr w:type="spellEnd"/>
+        <w:r>
+          <w:rPr>
+            <w:rStyle w:val="Hipervnculo"/>
+            <w:lang w:val="es-EC"/>
+          </w:rPr>
+          <w:t xml:space="preserve"> · Darwin-</w:t>
+        </w:r>
+        <w:proofErr w:type="spellStart"/>
+        <w:r>
+          <w:rPr>
+            <w:rStyle w:val="Hipervnculo"/>
+            <w:lang w:val="es-EC"/>
+          </w:rPr>
+          <w:t>Choez</w:t>
+        </w:r>
+        <w:proofErr w:type="spellEnd"/>
+        <w:r>
+          <w:rPr>
+            <w:rStyle w:val="Hipervnculo"/>
+            <w:lang w:val="es-EC"/>
+          </w:rPr>
+          <w:t>-G/</w:t>
+        </w:r>
+        <w:proofErr w:type="spellStart"/>
+        <w:r>
+          <w:rPr>
+            <w:rStyle w:val="Hipervnculo"/>
+            <w:lang w:val="es-EC"/>
+          </w:rPr>
+          <w:t>DesarrolloSoftwareUTMChG</w:t>
+        </w:r>
+        <w:proofErr w:type="spellEnd"/>
+      </w:hyperlink>
+    </w:p>
+    <w:p>
+      <w:pPr>
+        <w:rPr>
+          <w:lang w:val="es-EC"/>
+        </w:rPr>
+      </w:pPr>
+      <w:bookmarkStart w:id="0" w:name="_GoBack"/>
+      <w:bookmarkEnd w:id="0"/>
     </w:p>
     <w:sectPr>
       <w:pgSz w:w="12240" w:h="15840"/>
@@ -11394,6 +11820,7 @@
   <w:style w:type="character" w:default="1" w:styleId="Fuentedeprrafopredeter">
     <w:name w:val="Default Paragraph Font"/>
     <w:uiPriority w:val="1"/>
+    <w:semiHidden/>
     <w:unhideWhenUsed/>
   </w:style>
   <w:style w:type="table" w:default="1" w:styleId="Tablanormal">
@@ -11603,6 +12030,18 @@
     <w:name w:val="ͼk"/>
     <w:basedOn w:val="Fuentedeprrafopredeter"/>
     <w:rsid w:val="000408FD"/>
+  </w:style>
+  <w:style w:type="character" w:styleId="Hipervnculo">
+    <w:name w:val="Hyperlink"/>
+    <w:basedOn w:val="Fuentedeprrafopredeter"/>
+    <w:uiPriority w:val="99"/>
+    <w:semiHidden/>
+    <w:unhideWhenUsed/>
+    <w:rsid w:val="00B9658E"/>
+    <w:rPr>
+      <w:color w:val="0000FF"/>
+      <w:u w:val="single"/>
+    </w:rPr>
   </w:style>
 </w:styles>
 </file>

</xml_diff>